<commit_message>
Quills Up site: quillsup.org branding, fixed covers, company named only in About
Co-Authored-By: Claude Fable 5.1 <noreply@anthropic.com>
</commit_message>
<xml_diff>
--- a/01_K-2/K-2_Reproducibles.docx
+++ b/01_K-2/K-2_Reproducibles.docx
@@ -628,7 +628,7 @@
           <w:color w:val="2B2D42"/>
           <w:sz w:val="21"/>
         </w:rPr>
-        <w:t>A free kit by Competence Collective · competencecollective.org · quillsup.org</w:t>
+        <w:t>Hackles · a free kit · quillsup.org</w:t>
       </w:r>
     </w:p>
     <w:p>
@@ -685,7 +685,7 @@
         <w:rPr>
           <w:i/>
         </w:rPr>
-        <w:t>A free kit by Competence Collective · competencecollective.org · quillsup.org · © 2026 Competence Collective. Lesson text and teaching materials: CC BY-NC 4.0 (free to print, share and adapt for non-commercial use with credit). The Hackles name, logos, characters and artwork are not covered by that license: print and share them unaltered for classroom and family use; any other use needs written permission. [VERIFY with counsel]</w:t>
+        <w:t>Hackles · a free kit · quillsup.org · © 2026 Competence Collective. Lesson text and teaching materials: CC BY-NC 4.0 (free to print, share and adapt for non-commercial use with credit). The Hackles name, logos, characters and artwork are not covered by that license: print and share them unaltered for classroom and family use; any other use needs written permission. [VERIFY with counsel]</w:t>
       </w:r>
     </w:p>
     <w:p>
@@ -11899,7 +11899,7 @@
         <w:color w:val="5A5C70"/>
         <w:sz w:val="14"/>
       </w:rPr>
-      <w:t>Hackles · © 2026 Competence Collective · competencecollective.org · Text CC BY-NC 4.0 · Name, logos and art: all rights reserved</w:t>
+      <w:t>Hackles · quillsup.org · © 2026 Competence Collective · Text CC BY-NC 4.0 · Name, logos and art: all rights reserved</w:t>
     </w:r>
     <w:r>
       <w:tab/>

</xml_diff>